<commit_message>
Proximal Policy Algorithm with Cartpole example added
</commit_message>
<xml_diff>
--- a/Actor-Critic Algorithms/A3CGym/Analysis.docx
+++ b/Actor-Critic Algorithms/A3CGym/Analysis.docx
@@ -5,530 +5,15 @@
     <w:p>
       <w:pPr>
         <w:rPr>
-          <w:sz w:val="28"/>
-          <w:szCs w:val="28"/>
-        </w:rPr>
-      </w:pPr>
-      <w:bookmarkStart w:id="0" w:name="_Hlk125033940"/>
-      <w:r>
-        <w:rPr>
-          <w:sz w:val="28"/>
-          <w:szCs w:val="28"/>
-        </w:rPr>
-        <w:t>CPEG5</w:t>
-      </w:r>
-      <w:r>
-        <w:rPr>
-          <w:sz w:val="28"/>
-          <w:szCs w:val="28"/>
-        </w:rPr>
-        <w:t>91</w:t>
-      </w:r>
-      <w:r>
-        <w:rPr>
-          <w:sz w:val="28"/>
-          <w:szCs w:val="28"/>
-        </w:rPr>
-        <w:t xml:space="preserve">-2026SP- </w:t>
-      </w:r>
-      <w:r>
-        <w:rPr>
-          <w:sz w:val="28"/>
-          <w:szCs w:val="28"/>
-        </w:rPr>
-        <w:t>Reinforcement Learning</w:t>
-      </w:r>
-      <w:r>
-        <w:rPr>
-          <w:iCs/>
-          <w:sz w:val="28"/>
-          <w:szCs w:val="28"/>
-          <w:lang w:eastAsia="zh-CN"/>
-        </w:rPr>
-        <w:t>, Assignment #</w:t>
-      </w:r>
-      <w:r>
-        <w:rPr>
-          <w:iCs/>
-          <w:sz w:val="28"/>
-          <w:szCs w:val="28"/>
-          <w:lang w:eastAsia="zh-CN"/>
-        </w:rPr>
-        <w:t>9</w:t>
-      </w:r>
-    </w:p>
-    <w:p>
-      <w:pPr>
-        <w:autoSpaceDE w:val="0"/>
-        <w:autoSpaceDN w:val="0"/>
-        <w:adjustRightInd w:val="0"/>
-        <w:ind w:right="-720" w:firstLineChars="845" w:firstLine="2715"/>
-        <w:rPr>
-          <w:b/>
-          <w:bCs/>
-          <w:i/>
-          <w:iCs/>
           <w:sz w:val="32"/>
           <w:szCs w:val="32"/>
         </w:rPr>
       </w:pPr>
-    </w:p>
-    <w:p>
-      <w:pPr>
-        <w:tabs>
-          <w:tab w:val="left" w:pos="5835"/>
-        </w:tabs>
-        <w:autoSpaceDE w:val="0"/>
-        <w:autoSpaceDN w:val="0"/>
-        <w:adjustRightInd w:val="0"/>
-        <w:ind w:right="-720"/>
-        <w:rPr>
-          <w:b/>
-          <w:bCs/>
-          <w:iCs/>
-          <w:sz w:val="48"/>
-          <w:szCs w:val="48"/>
-          <w:lang w:eastAsia="zh-CN"/>
-        </w:rPr>
-      </w:pPr>
-    </w:p>
-    <w:p>
-      <w:pPr>
-        <w:pStyle w:val="Default"/>
-        <w:jc w:val="center"/>
-        <w:rPr>
-          <w:rFonts w:asciiTheme="minorHAnsi" w:hAnsiTheme="minorHAnsi" w:cstheme="minorHAnsi"/>
-          <w:sz w:val="48"/>
-          <w:szCs w:val="48"/>
-        </w:rPr>
-      </w:pPr>
-      <w:r>
-        <w:rPr>
-          <w:rFonts w:asciiTheme="minorHAnsi" w:hAnsiTheme="minorHAnsi" w:cstheme="minorHAnsi"/>
-          <w:b/>
-          <w:bCs/>
-          <w:sz w:val="48"/>
-          <w:szCs w:val="48"/>
-        </w:rPr>
-        <w:t>CP</w:t>
-      </w:r>
-      <w:r>
-        <w:rPr>
-          <w:rFonts w:asciiTheme="minorHAnsi" w:hAnsiTheme="minorHAnsi" w:cstheme="minorHAnsi"/>
-          <w:b/>
-          <w:bCs/>
-          <w:sz w:val="48"/>
-          <w:szCs w:val="48"/>
-        </w:rPr>
-        <w:t>EG</w:t>
-      </w:r>
-      <w:r>
-        <w:rPr>
-          <w:rFonts w:asciiTheme="minorHAnsi" w:hAnsiTheme="minorHAnsi" w:cstheme="minorHAnsi"/>
-          <w:b/>
-          <w:bCs/>
-          <w:sz w:val="48"/>
-          <w:szCs w:val="48"/>
-        </w:rPr>
-        <w:t xml:space="preserve"> </w:t>
-      </w:r>
-      <w:r>
-        <w:rPr>
-          <w:rFonts w:asciiTheme="minorHAnsi" w:hAnsiTheme="minorHAnsi" w:cstheme="minorHAnsi"/>
-          <w:b/>
-          <w:bCs/>
-          <w:sz w:val="48"/>
-          <w:szCs w:val="48"/>
-        </w:rPr>
-        <w:t>591</w:t>
-      </w:r>
-      <w:r>
-        <w:rPr>
-          <w:rFonts w:asciiTheme="minorHAnsi" w:hAnsiTheme="minorHAnsi" w:cstheme="minorHAnsi"/>
-          <w:b/>
-          <w:bCs/>
-          <w:sz w:val="48"/>
-          <w:szCs w:val="48"/>
-        </w:rPr>
-        <w:t xml:space="preserve"> – Assignment #</w:t>
-      </w:r>
-      <w:r>
-        <w:rPr>
-          <w:rFonts w:asciiTheme="minorHAnsi" w:hAnsiTheme="minorHAnsi" w:cstheme="minorHAnsi"/>
-          <w:b/>
-          <w:bCs/>
-          <w:sz w:val="48"/>
-          <w:szCs w:val="48"/>
-        </w:rPr>
-        <w:t>9</w:t>
-      </w:r>
-    </w:p>
-    <w:p>
-      <w:pPr>
-        <w:autoSpaceDE w:val="0"/>
-        <w:autoSpaceDN w:val="0"/>
-        <w:adjustRightInd w:val="0"/>
-        <w:ind w:right="-720"/>
-        <w:jc w:val="center"/>
-        <w:rPr>
-          <w:bCs/>
-          <w:iCs/>
-          <w:sz w:val="40"/>
-          <w:szCs w:val="40"/>
-          <w:lang w:eastAsia="zh-CN"/>
-        </w:rPr>
-      </w:pPr>
-    </w:p>
-    <w:p>
-      <w:pPr>
-        <w:autoSpaceDE w:val="0"/>
-        <w:autoSpaceDN w:val="0"/>
-        <w:adjustRightInd w:val="0"/>
-        <w:ind w:right="-720"/>
-        <w:jc w:val="center"/>
-        <w:rPr>
-          <w:bCs/>
-          <w:iCs/>
-          <w:sz w:val="40"/>
-          <w:szCs w:val="40"/>
-          <w:lang w:eastAsia="zh-CN"/>
-        </w:rPr>
-      </w:pPr>
-      <w:r>
-        <w:rPr>
-          <w:bCs/>
-          <w:iCs/>
-          <w:sz w:val="40"/>
-          <w:szCs w:val="40"/>
-          <w:lang w:eastAsia="zh-CN"/>
-        </w:rPr>
-        <w:t xml:space="preserve">Submitted by: </w:t>
-      </w:r>
-    </w:p>
-    <w:p>
-      <w:pPr>
-        <w:autoSpaceDE w:val="0"/>
-        <w:autoSpaceDN w:val="0"/>
-        <w:adjustRightInd w:val="0"/>
-        <w:ind w:right="-720"/>
-        <w:jc w:val="center"/>
-        <w:rPr>
-          <w:bCs/>
-          <w:iCs/>
-          <w:sz w:val="40"/>
-          <w:szCs w:val="40"/>
-          <w:lang w:eastAsia="zh-CN"/>
-        </w:rPr>
-      </w:pPr>
-      <w:r>
-        <w:rPr>
-          <w:bCs/>
-          <w:iCs/>
-          <w:sz w:val="40"/>
-          <w:szCs w:val="40"/>
-          <w:lang w:eastAsia="zh-CN"/>
-        </w:rPr>
-        <w:t>Shariar Islam Saimon</w:t>
-      </w:r>
-    </w:p>
-    <w:p>
-      <w:pPr>
-        <w:autoSpaceDE w:val="0"/>
-        <w:autoSpaceDN w:val="0"/>
-        <w:adjustRightInd w:val="0"/>
-        <w:ind w:right="-720"/>
-        <w:jc w:val="center"/>
-        <w:rPr>
-          <w:bCs/>
-          <w:iCs/>
-          <w:sz w:val="40"/>
-          <w:szCs w:val="40"/>
-          <w:lang w:eastAsia="zh-CN"/>
-        </w:rPr>
-      </w:pPr>
-      <w:r>
-        <w:rPr>
-          <w:bCs/>
-          <w:iCs/>
-          <w:sz w:val="40"/>
-          <w:szCs w:val="40"/>
-          <w:lang w:eastAsia="zh-CN"/>
-        </w:rPr>
-        <w:t xml:space="preserve"> (Student ID: 1147129)</w:t>
-      </w:r>
-    </w:p>
-    <w:p>
-      <w:pPr>
-        <w:autoSpaceDE w:val="0"/>
-        <w:autoSpaceDN w:val="0"/>
-        <w:adjustRightInd w:val="0"/>
-        <w:ind w:right="-720"/>
-        <w:jc w:val="center"/>
-        <w:rPr>
-          <w:bCs/>
-          <w:iCs/>
-          <w:sz w:val="40"/>
-          <w:szCs w:val="40"/>
-          <w:lang w:eastAsia="zh-CN"/>
-        </w:rPr>
-      </w:pPr>
-    </w:p>
-    <w:p>
-      <w:pPr>
-        <w:autoSpaceDE w:val="0"/>
-        <w:autoSpaceDN w:val="0"/>
-        <w:adjustRightInd w:val="0"/>
-        <w:ind w:right="-720"/>
-        <w:rPr>
-          <w:b/>
-          <w:bCs/>
-          <w:i/>
-          <w:iCs/>
-          <w:sz w:val="32"/>
-          <w:szCs w:val="32"/>
-        </w:rPr>
-      </w:pPr>
-      <w:r>
-        <w:rPr>
-          <w:b/>
-          <w:bCs/>
-          <w:i/>
-          <w:iCs/>
-          <w:sz w:val="32"/>
-          <w:szCs w:val="32"/>
-        </w:rPr>
-        <w:t xml:space="preserve">                        </w:t>
-      </w:r>
-    </w:p>
-    <w:p>
-      <w:pPr>
-        <w:autoSpaceDE w:val="0"/>
-        <w:autoSpaceDN w:val="0"/>
-        <w:adjustRightInd w:val="0"/>
-        <w:ind w:right="-720"/>
-        <w:jc w:val="center"/>
-        <w:rPr>
-          <w:b/>
-          <w:bCs/>
-          <w:i/>
-          <w:iCs/>
-          <w:sz w:val="32"/>
-          <w:szCs w:val="32"/>
-        </w:rPr>
-      </w:pPr>
-      <w:r>
-        <w:rPr>
-          <w:noProof/>
-        </w:rPr>
-        <w:drawing>
-          <wp:inline distT="0" distB="0" distL="0" distR="0" wp14:anchorId="7FC770CE" wp14:editId="213F99C1">
-            <wp:extent cx="1205244" cy="1148938"/>
-            <wp:effectExtent l="0" t="0" r="0" b="0"/>
-            <wp:docPr id="16" name="Picture 16" descr="Logo&#10;&#10;Description automatically generated"/>
-            <wp:cNvGraphicFramePr>
-              <a:graphicFrameLocks xmlns:a="http://schemas.openxmlformats.org/drawingml/2006/main" noChangeAspect="1"/>
-            </wp:cNvGraphicFramePr>
-            <a:graphic xmlns:a="http://schemas.openxmlformats.org/drawingml/2006/main">
-              <a:graphicData uri="http://schemas.openxmlformats.org/drawingml/2006/picture">
-                <pic:pic xmlns:pic="http://schemas.openxmlformats.org/drawingml/2006/picture">
-                  <pic:nvPicPr>
-                    <pic:cNvPr id="4" name="Picture 4" descr="Logo&#10;&#10;Description automatically generated"/>
-                    <pic:cNvPicPr>
-                      <a:picLocks noChangeAspect="1" noChangeArrowheads="1"/>
-                    </pic:cNvPicPr>
-                  </pic:nvPicPr>
-                  <pic:blipFill>
-                    <a:blip r:embed="rId8" r:link="rId9">
-                      <a:extLst>
-                        <a:ext uri="{28A0092B-C50C-407E-A947-70E740481C1C}">
-                          <a14:useLocalDpi xmlns:a14="http://schemas.microsoft.com/office/drawing/2010/main" val="0"/>
-                        </a:ext>
-                      </a:extLst>
-                    </a:blip>
-                    <a:srcRect/>
-                    <a:stretch>
-                      <a:fillRect/>
-                    </a:stretch>
-                  </pic:blipFill>
-                  <pic:spPr bwMode="auto">
-                    <a:xfrm>
-                      <a:off x="0" y="0"/>
-                      <a:ext cx="1209700" cy="1153186"/>
-                    </a:xfrm>
-                    <a:prstGeom prst="rect">
-                      <a:avLst/>
-                    </a:prstGeom>
-                    <a:noFill/>
-                    <a:ln>
-                      <a:noFill/>
-                    </a:ln>
-                  </pic:spPr>
-                </pic:pic>
-              </a:graphicData>
-            </a:graphic>
-          </wp:inline>
-        </w:drawing>
-      </w:r>
-    </w:p>
-    <w:p>
-      <w:pPr>
-        <w:autoSpaceDE w:val="0"/>
-        <w:autoSpaceDN w:val="0"/>
-        <w:adjustRightInd w:val="0"/>
-        <w:ind w:right="-720"/>
-        <w:rPr>
-          <w:b/>
-          <w:bCs/>
-          <w:i/>
-          <w:iCs/>
-          <w:sz w:val="32"/>
-          <w:szCs w:val="32"/>
-        </w:rPr>
-      </w:pPr>
-    </w:p>
-    <w:p>
-      <w:pPr>
-        <w:autoSpaceDE w:val="0"/>
-        <w:autoSpaceDN w:val="0"/>
-        <w:adjustRightInd w:val="0"/>
-        <w:ind w:right="-720"/>
-        <w:jc w:val="center"/>
-        <w:rPr>
-          <w:bCs/>
-          <w:iCs/>
-          <w:sz w:val="40"/>
-          <w:szCs w:val="40"/>
-          <w:lang w:eastAsia="zh-CN"/>
-        </w:rPr>
-      </w:pPr>
-    </w:p>
-    <w:p>
-      <w:pPr>
-        <w:autoSpaceDE w:val="0"/>
-        <w:autoSpaceDN w:val="0"/>
-        <w:adjustRightInd w:val="0"/>
-        <w:ind w:right="-720"/>
-        <w:jc w:val="center"/>
-        <w:rPr>
-          <w:bCs/>
-          <w:iCs/>
-          <w:sz w:val="36"/>
-          <w:szCs w:val="36"/>
-          <w:lang w:eastAsia="zh-CN"/>
-        </w:rPr>
-      </w:pPr>
-      <w:r>
-        <w:rPr>
-          <w:bCs/>
-          <w:iCs/>
-          <w:sz w:val="36"/>
-          <w:szCs w:val="36"/>
-          <w:lang w:eastAsia="zh-CN"/>
-        </w:rPr>
-        <w:t>Department of Electrical/Computer Engineering</w:t>
-      </w:r>
-    </w:p>
-    <w:p>
-      <w:pPr>
-        <w:autoSpaceDE w:val="0"/>
-        <w:autoSpaceDN w:val="0"/>
-        <w:adjustRightInd w:val="0"/>
-        <w:ind w:right="-720"/>
-        <w:jc w:val="center"/>
-        <w:rPr>
-          <w:bCs/>
-          <w:iCs/>
-          <w:sz w:val="36"/>
-          <w:szCs w:val="36"/>
-          <w:lang w:eastAsia="zh-CN"/>
-        </w:rPr>
-      </w:pPr>
-      <w:r>
-        <w:rPr>
-          <w:bCs/>
-          <w:iCs/>
-          <w:sz w:val="36"/>
-          <w:szCs w:val="36"/>
-          <w:lang w:eastAsia="zh-CN"/>
-        </w:rPr>
-        <w:t>University of Bridgeport</w:t>
-      </w:r>
-    </w:p>
-    <w:p>
-      <w:pPr>
-        <w:autoSpaceDE w:val="0"/>
-        <w:autoSpaceDN w:val="0"/>
-        <w:adjustRightInd w:val="0"/>
-        <w:ind w:right="-720"/>
-        <w:jc w:val="center"/>
-        <w:rPr>
-          <w:bCs/>
-          <w:iCs/>
-          <w:sz w:val="36"/>
-          <w:szCs w:val="36"/>
-          <w:lang w:eastAsia="zh-CN"/>
-        </w:rPr>
-      </w:pPr>
-      <w:r>
-        <w:rPr>
-          <w:bCs/>
-          <w:iCs/>
-          <w:sz w:val="36"/>
-          <w:szCs w:val="36"/>
-          <w:lang w:eastAsia="zh-CN"/>
-        </w:rPr>
-        <w:t>Bridgeport, CT-06604</w:t>
-      </w:r>
-    </w:p>
-    <w:p>
-      <w:pPr>
-        <w:autoSpaceDE w:val="0"/>
-        <w:autoSpaceDN w:val="0"/>
-        <w:adjustRightInd w:val="0"/>
-        <w:ind w:right="-720"/>
-        <w:jc w:val="center"/>
-        <w:rPr>
-          <w:bCs/>
-          <w:iCs/>
-          <w:sz w:val="36"/>
-          <w:szCs w:val="36"/>
-          <w:lang w:eastAsia="zh-CN"/>
-        </w:rPr>
-      </w:pPr>
-      <w:r>
-        <w:rPr>
-          <w:bCs/>
-          <w:iCs/>
-          <w:sz w:val="36"/>
-          <w:szCs w:val="36"/>
-          <w:lang w:eastAsia="zh-CN"/>
-        </w:rPr>
-        <w:t>USA</w:t>
-      </w:r>
-    </w:p>
-    <w:bookmarkEnd w:id="0"/>
-    <w:p>
-      <w:pPr>
-        <w:rPr>
-          <w:rFonts w:cstheme="minorHAnsi"/>
-          <w:sz w:val="28"/>
-          <w:szCs w:val="28"/>
-        </w:rPr>
-      </w:pPr>
-    </w:p>
-    <w:p>
-      <w:pPr>
+      <w:r>
         <w:rPr>
           <w:sz w:val="32"/>
           <w:szCs w:val="32"/>
         </w:rPr>
-      </w:pPr>
-      <w:r>
-        <w:rPr>
-          <w:sz w:val="32"/>
-          <w:szCs w:val="32"/>
-        </w:rPr>
-        <w:lastRenderedPageBreak/>
         <w:t>Problem (</w:t>
       </w:r>
       <w:r>
@@ -610,7 +95,7 @@
                     <pic:cNvPicPr/>
                   </pic:nvPicPr>
                   <pic:blipFill rotWithShape="1">
-                    <a:blip r:embed="rId10"/>
+                    <a:blip r:embed="rId8"/>
                     <a:srcRect r="192"/>
                     <a:stretch>
                       <a:fillRect/>
@@ -662,7 +147,7 @@
                     <pic:cNvPicPr/>
                   </pic:nvPicPr>
                   <pic:blipFill>
-                    <a:blip r:embed="rId11"/>
+                    <a:blip r:embed="rId9"/>
                     <a:stretch>
                       <a:fillRect/>
                     </a:stretch>
@@ -706,7 +191,7 @@
                     <pic:cNvPicPr/>
                   </pic:nvPicPr>
                   <pic:blipFill>
-                    <a:blip r:embed="rId12"/>
+                    <a:blip r:embed="rId10"/>
                     <a:stretch>
                       <a:fillRect/>
                     </a:stretch>
@@ -748,7 +233,7 @@
                     <pic:cNvPicPr/>
                   </pic:nvPicPr>
                   <pic:blipFill>
-                    <a:blip r:embed="rId13"/>
+                    <a:blip r:embed="rId11"/>
                     <a:stretch>
                       <a:fillRect/>
                     </a:stretch>
@@ -791,7 +276,7 @@
                     <pic:cNvPicPr/>
                   </pic:nvPicPr>
                   <pic:blipFill>
-                    <a:blip r:embed="rId14"/>
+                    <a:blip r:embed="rId12"/>
                     <a:stretch>
                       <a:fillRect/>
                     </a:stretch>
@@ -833,7 +318,7 @@
                     <pic:cNvPicPr/>
                   </pic:nvPicPr>
                   <pic:blipFill>
-                    <a:blip r:embed="rId15"/>
+                    <a:blip r:embed="rId13"/>
                     <a:stretch>
                       <a:fillRect/>
                     </a:stretch>
@@ -876,7 +361,7 @@
                     <pic:cNvPicPr/>
                   </pic:nvPicPr>
                   <pic:blipFill>
-                    <a:blip r:embed="rId16"/>
+                    <a:blip r:embed="rId14"/>
                     <a:stretch>
                       <a:fillRect/>
                     </a:stretch>
@@ -918,7 +403,7 @@
                     <pic:cNvPicPr/>
                   </pic:nvPicPr>
                   <pic:blipFill>
-                    <a:blip r:embed="rId17"/>
+                    <a:blip r:embed="rId15"/>
                     <a:stretch>
                       <a:fillRect/>
                     </a:stretch>
@@ -2508,6 +1993,7 @@
   <w:style w:type="character" w:default="1" w:styleId="DefaultParagraphFont">
     <w:name w:val="Default Paragraph Font"/>
     <w:uiPriority w:val="1"/>
+    <w:semiHidden/>
     <w:unhideWhenUsed/>
   </w:style>
   <w:style w:type="table" w:default="1" w:styleId="TableNormal">

</xml_diff>